<commit_message>
docs: finalize verified project report
</commit_message>
<xml_diff>
--- a/output/docx/JalDrishti_Complete_Project_Documentation.docx
+++ b/output/docx/JalDrishti_Complete_Project_Documentation.docx
@@ -332,7 +332,7 @@
                 <w:color w:val="0B2B24"/>
                 <w:sz w:val="18"/>
               </w:rPr>
-              <w:t>0a385c0</w:t>
+              <w:t>a1ede18</w:t>
             </w:r>
           </w:p>
         </w:tc>
@@ -376,7 +376,7 @@
                 <w:color w:val="0B2B24"/>
                 <w:sz w:val="18"/>
               </w:rPr>
-              <w:t>29 August 2026</w:t>
+              <w:t>1 September 2026</w:t>
             </w:r>
           </w:p>
         </w:tc>
@@ -725,7 +725,7 @@
                 <w:color w:val="0B2B24"/>
                 <w:sz w:val="17"/>
               </w:rPr>
-              <w:t>0a385c0 deployed on both Render services</w:t>
+              <w:t>a1ede18 deployed on both Render services</w:t>
             </w:r>
           </w:p>
         </w:tc>
@@ -1057,9 +1057,23 @@
     <w:p>
       <w:pPr>
         <w:spacing w:after="60"/>
+        <w:ind w:left="360"/>
+      </w:pPr>
+      <w:hyperlink w:anchor="sec_019">
+        <w:r>
+          <w:rPr>
+            <w:rStyle w:val="Hyperlink"/>
+          </w:rPr>
+          <w:t>4.5 Independent numerical reconciliation</w:t>
+        </w:r>
+      </w:hyperlink>
+    </w:p>
+    <w:p>
+      <w:pPr>
+        <w:spacing w:after="60"/>
         <w:ind w:left="0"/>
       </w:pPr>
-      <w:hyperlink w:anchor="sec_019">
+      <w:hyperlink w:anchor="sec_020">
         <w:r>
           <w:rPr>
             <w:rStyle w:val="Hyperlink"/>
@@ -1073,7 +1087,7 @@
         <w:spacing w:after="60"/>
         <w:ind w:left="0"/>
       </w:pPr>
-      <w:hyperlink w:anchor="sec_020">
+      <w:hyperlink w:anchor="sec_021">
         <w:r>
           <w:rPr>
             <w:rStyle w:val="Hyperlink"/>
@@ -1087,7 +1101,7 @@
         <w:spacing w:after="60"/>
         <w:ind w:left="0"/>
       </w:pPr>
-      <w:hyperlink w:anchor="sec_021">
+      <w:hyperlink w:anchor="sec_022">
         <w:r>
           <w:rPr>
             <w:rStyle w:val="Hyperlink"/>
@@ -1101,7 +1115,7 @@
         <w:spacing w:after="60"/>
         <w:ind w:left="0"/>
       </w:pPr>
-      <w:hyperlink w:anchor="sec_022">
+      <w:hyperlink w:anchor="sec_023">
         <w:r>
           <w:rPr>
             <w:rStyle w:val="Hyperlink"/>
@@ -1115,7 +1129,7 @@
         <w:spacing w:after="60"/>
         <w:ind w:left="0"/>
       </w:pPr>
-      <w:hyperlink w:anchor="sec_023">
+      <w:hyperlink w:anchor="sec_024">
         <w:r>
           <w:rPr>
             <w:rStyle w:val="Hyperlink"/>
@@ -1129,7 +1143,7 @@
         <w:spacing w:after="60"/>
         <w:ind w:left="0"/>
       </w:pPr>
-      <w:hyperlink w:anchor="sec_024">
+      <w:hyperlink w:anchor="sec_025">
         <w:r>
           <w:rPr>
             <w:rStyle w:val="Hyperlink"/>
@@ -1143,7 +1157,7 @@
         <w:spacing w:after="60"/>
         <w:ind w:left="0"/>
       </w:pPr>
-      <w:hyperlink w:anchor="sec_025">
+      <w:hyperlink w:anchor="sec_026">
         <w:r>
           <w:rPr>
             <w:rStyle w:val="Hyperlink"/>
@@ -1157,7 +1171,7 @@
         <w:spacing w:after="60"/>
         <w:ind w:left="0"/>
       </w:pPr>
-      <w:hyperlink w:anchor="sec_026">
+      <w:hyperlink w:anchor="sec_027">
         <w:r>
           <w:rPr>
             <w:rStyle w:val="Hyperlink"/>
@@ -1171,7 +1185,7 @@
         <w:spacing w:after="60"/>
         <w:ind w:left="0"/>
       </w:pPr>
-      <w:hyperlink w:anchor="sec_027">
+      <w:hyperlink w:anchor="sec_028">
         <w:r>
           <w:rPr>
             <w:rStyle w:val="Hyperlink"/>
@@ -1185,7 +1199,7 @@
         <w:spacing w:after="60"/>
         <w:ind w:left="0"/>
       </w:pPr>
-      <w:hyperlink w:anchor="sec_028">
+      <w:hyperlink w:anchor="sec_029">
         <w:r>
           <w:rPr>
             <w:rStyle w:val="Hyperlink"/>
@@ -1199,7 +1213,7 @@
         <w:spacing w:after="60"/>
         <w:ind w:left="0"/>
       </w:pPr>
-      <w:hyperlink w:anchor="sec_029">
+      <w:hyperlink w:anchor="sec_030">
         <w:r>
           <w:rPr>
             <w:rStyle w:val="Hyperlink"/>
@@ -1213,7 +1227,7 @@
         <w:spacing w:after="60"/>
         <w:ind w:left="0"/>
       </w:pPr>
-      <w:hyperlink w:anchor="sec_030">
+      <w:hyperlink w:anchor="sec_031">
         <w:r>
           <w:rPr>
             <w:rStyle w:val="Hyperlink"/>
@@ -1227,7 +1241,7 @@
         <w:spacing w:after="60"/>
         <w:ind w:left="0"/>
       </w:pPr>
-      <w:hyperlink w:anchor="sec_031">
+      <w:hyperlink w:anchor="sec_032">
         <w:r>
           <w:rPr>
             <w:rStyle w:val="Hyperlink"/>
@@ -2313,18 +2327,72 @@
                 <w:color w:val="0B2B24"/>
                 <w:sz w:val="16"/>
               </w:rPr>
-              <w:t>React / Leaflet</w:t>
+              <w:t>graph TD</w:t>
               <w:br/>
-              <w:t xml:space="preserve">  |-- KML/KMZ multipart --&gt; FastAPI --&gt; safe parser --&gt; interpolated DEM</w:t>
+              <w:t xml:space="preserve">    UI[React / Leaflet Client]</w:t>
               <w:br/>
-              <w:t xml:space="preserve">  |                                              `--&gt; D8 catchment JSON</w:t>
+              <w:t xml:space="preserve">    </w:t>
               <w:br/>
-              <w:t xml:space="preserve">  `-- location + radius --&gt; FastAPI --&gt; elevation + rainfall + imagery</w:t>
+              <w:t xml:space="preserve">    subgraph FastAPI Backend</w:t>
               <w:br/>
-              <w:t xml:space="preserve">                                                 `--&gt; runoff + pond screen</w:t>
+              <w:t xml:space="preserve">        API[API Router]</w:t>
+              <w:br/>
+              <w:t xml:space="preserve">        Parse[KML/KMZ Parser]</w:t>
+              <w:br/>
+              <w:t xml:space="preserve">        Terrain[Terrain Reconstruction]</w:t>
+              <w:br/>
+              <w:t xml:space="preserve">        Hydro[D8 Hydrology Pipeline]</w:t>
+              <w:br/>
+              <w:t xml:space="preserve">        Loc[Location API]</w:t>
+              <w:br/>
+              <w:t xml:space="preserve">        CV[CV Satellite Screening]</w:t>
+              <w:br/>
+              <w:t xml:space="preserve">    end</w:t>
+              <w:br/>
+              <w:t xml:space="preserve">    </w:t>
+              <w:br/>
+              <w:t xml:space="preserve">    subgraph External Services</w:t>
+              <w:br/>
+              <w:t xml:space="preserve">        Meteo[Open-Meteo Rainfall/Elevation]</w:t>
+              <w:br/>
+              <w:t xml:space="preserve">        NASA[NASA POWER Fallback]</w:t>
+              <w:br/>
+              <w:t xml:space="preserve">        Sat[Satellite Imagery]</w:t>
+              <w:br/>
+              <w:t xml:space="preserve">    end</w:t>
               <w:br/>
               <w:br/>
-              <w:t>Optional protected history -------------------------------&gt; PostgreSQL</w:t>
+              <w:t xml:space="preserve">    UI -- "Multipart KML Upload" --&gt; API</w:t>
+              <w:br/>
+              <w:t xml:space="preserve">    API --&gt; Parse</w:t>
+              <w:br/>
+              <w:t xml:space="preserve">    Parse --&gt; Terrain</w:t>
+              <w:br/>
+              <w:t xml:space="preserve">    Terrain --&gt; Hydro</w:t>
+              <w:br/>
+              <w:t xml:space="preserve">    </w:t>
+              <w:br/>
+              <w:t xml:space="preserve">    UI -- "Location + Radius" --&gt; Loc</w:t>
+              <w:br/>
+              <w:t xml:space="preserve">    Loc --&gt; Meteo</w:t>
+              <w:br/>
+              <w:t xml:space="preserve">    Loc --&gt; NASA</w:t>
+              <w:br/>
+              <w:t xml:space="preserve">    Loc --&gt; Sat</w:t>
+              <w:br/>
+              <w:t xml:space="preserve">    Sat --&gt; CV</w:t>
+              <w:br/>
+              <w:t xml:space="preserve">    CV --&gt; Hydro</w:t>
+              <w:br/>
+              <w:t xml:space="preserve">    </w:t>
+              <w:br/>
+              <w:t xml:space="preserve">    Hydro --&gt; UI</w:t>
+              <w:br/>
+              <w:t xml:space="preserve">    </w:t>
+              <w:br/>
+              <w:t xml:space="preserve">    DB[(Optional PostgreSQL History)]</w:t>
+              <w:br/>
+              <w:t xml:space="preserve">    API -. "Save History" .-&gt; DB</w:t>
             </w:r>
           </w:p>
         </w:tc>
@@ -2414,7 +2482,7 @@
           <w:color w:val="0B2B24"/>
           <w:sz w:val="22"/>
         </w:rPr>
-        <w:t>The canonical route is POST /api/analyze-contour; the multipart field name is contour_file. Hidden compatibility aliases /api/analyzeContour and /api/findCatchment accept the same request. The route reads at most the configured 15 MiB plus one byte, closes the temporary upload, and runs CPU work in a worker thread.</w:t>
+        <w:t>The canonical route is POST /api/analyze-contour. For the course evaluator, the required multipart field name is exactly contour_map; the UI-compatible alias contour_file is also accepted. Compatibility routes /api/analyzeContour and /api/findCatchment accept the same request. The route reads at most the configured 15 MiB plus one byte, closes the temporary upload, and runs CPU work in a worker thread.</w:t>
       </w:r>
     </w:p>
     <w:p>
@@ -2460,7 +2528,7 @@
           <w:color w:val="0B2B24"/>
           <w:sz w:val="22"/>
         </w:rPr>
-        <w:t>KML stores vector isolines rather than a complete elevation raster. The service projects the study extent to a latitude-corrected metric grid. Grid dimensions are selected from input extent and contour interval, then bounded by configuration. Each contour is rasterized into fixed observed cells. Unknown interior cells are initialized from neighboring observations and solved by iterative harmonic interpolation while observed values remain fixed. The result records observed-cell ratio, iteration count, convergence, cell size, and method.</w:t>
+        <w:t>KML stores vector isolines rather than a complete elevation raster. The service projects the study extent to a latitude-corrected metric grid. Grid dimensions are selected from input extent and contour interval, then bounded by configuration. Each contour is rasterized into fixed observed cells. Unknown interior cells are initialized from neighboring observations and solved by iterative harmonic interpolation while observed values remain fixed. The result records observed-cell ratio, iteration count, convergence, cell size, and method. It also returns a transparent elevation-colour PNG aligned to geographic bounds; this surface is a visualization of reconstructed terrain height, not a water or river layer.</w:t>
       </w:r>
     </w:p>
     <w:p>
@@ -2472,7 +2540,7 @@
           <w:color w:val="0B2B24"/>
           <w:sz w:val="22"/>
         </w:rPr>
-        <w:t>The study boundary masks both interpolation and later hydrology so cells outside the uploaded domain cannot become part of the catchment. Results are always labelled degraded, even on successful convergence, because an interpolated surface is not equivalent to a surveyed DEM.</w:t>
+        <w:t>The study boundary masks both interpolation and later hydrology so cells outside the uploaded domain cannot become part of the catchment. A successfully computed response has analysis_status: complete; its nested quality metadata remains degraded because an interpolated contour surface is not equivalent to a surveyed raster DEM. These fields answer different questions: completion says the software finished, while quality describes the strength of the evidence.</w:t>
       </w:r>
     </w:p>
     <w:p>
@@ -2983,7 +3051,7 @@
           <w:color w:val="0B2B24"/>
           <w:sz w:val="22"/>
         </w:rPr>
-        <w:t>The supplied contours_1m.kml was processed through release 0a385c0 of the deployed service on 29 August 2026. The measured automatic output was:</w:t>
+        <w:t>The supplied contours_1m.kml was reprocessed through release a1ede18 of the deployed service on 1 September 2026 using the teacher-required contour_map field. The request returned HTTP 200 and analysis_status: complete. The measured automatic output was:</w:t>
       </w:r>
     </w:p>
     <w:tbl>
@@ -4002,7 +4070,7 @@
                 <w:color w:val="0B2B24"/>
                 <w:sz w:val="17"/>
               </w:rPr>
-              <w:t>Production API time</w:t>
+              <w:t>Production API result</w:t>
             </w:r>
           </w:p>
         </w:tc>
@@ -4023,7 +4091,7 @@
                 <w:color w:val="0B2B24"/>
                 <w:sz w:val="17"/>
               </w:rPr>
-              <w:t>12.47 s, HTTP 200</w:t>
+              <w:t>HTTP 200, complete</w:t>
             </w:r>
           </w:p>
         </w:tc>
@@ -4664,14 +4732,36 @@
     </w:p>
     <w:p>
       <w:pPr>
+        <w:pStyle w:val="Heading2"/>
+      </w:pPr>
+      <w:bookmarkStart w:id="28" w:name="sec_019"/>
+      <w:r>
+        <w:t>4.5 Independent numerical reconciliation</w:t>
+      </w:r>
+      <w:bookmarkEnd w:id="28"/>
+    </w:p>
+    <w:p>
+      <w:r>
+        <w:rPr>
+          <w:rFonts w:ascii="Calibri" w:hAnsi="Calibri"/>
+          <w:b w:val="0"/>
+          <w:i w:val="0"/>
+          <w:color w:val="0B2B24"/>
+          <w:sz w:val="22"/>
+        </w:rPr>
+        <w:t>The final verification recomputed the principal outputs without using the API's rounded result fields. Area conversion gave 3,529,523.47 / 10,000 = 352.952347 ha, which rounds to the returned 352.9523 ha. Annual runoff used V = C × A × P, with C = 0.30 and P = 1.28013 m, giving 1,355,474.6639 m³/year; the response is 1,355,474.66 m³/year. Applying the configured 80% capture target gives 1,084,379.7311 m³, matching the returned 1,084,379.73 m³. The three pond options were respectively 334.35 m, 262.63 m, and 435.54 m from the buffered detected-water mask, all greater than the 60 m hard exclusion; their boundary clearances were 467.99 m, 341.99 m, and 593.99 m, all greater than the 75 m analysis-boundary setback. A source scan found no production-service literal for the sample coordinate or output values.</w:t>
+      </w:r>
+    </w:p>
+    <w:p>
+      <w:pPr>
         <w:pStyle w:val="Heading1"/>
         <w:pageBreakBefore/>
       </w:pPr>
-      <w:bookmarkStart w:id="28" w:name="sec_019"/>
+      <w:bookmarkStart w:id="29" w:name="sec_020"/>
       <w:r>
         <w:t>5. Location-based elevation and hydrology</w:t>
       </w:r>
-      <w:bookmarkEnd w:id="28"/>
+      <w:bookmarkEnd w:id="29"/>
     </w:p>
     <w:p>
       <w:r>
@@ -4726,11 +4816,11 @@
         <w:pStyle w:val="Heading1"/>
         <w:pageBreakBefore/>
       </w:pPr>
-      <w:bookmarkStart w:id="29" w:name="sec_020"/>
+      <w:bookmarkStart w:id="30" w:name="sec_021"/>
       <w:r>
         <w:t>6. Rainfall analysis</w:t>
       </w:r>
-      <w:bookmarkEnd w:id="29"/>
+      <w:bookmarkEnd w:id="30"/>
     </w:p>
     <w:p>
       <w:pPr>
@@ -4822,11 +4912,11 @@
         <w:pStyle w:val="Heading1"/>
         <w:pageBreakBefore/>
       </w:pPr>
-      <w:bookmarkStart w:id="30" w:name="sec_021"/>
+      <w:bookmarkStart w:id="31" w:name="sec_022"/>
       <w:r>
         <w:t>7. Satellite surface screening and land limits</w:t>
       </w:r>
-      <w:bookmarkEnd w:id="30"/>
+      <w:bookmarkEnd w:id="31"/>
     </w:p>
     <w:p>
       <w:r>
@@ -4869,11 +4959,11 @@
         <w:pStyle w:val="Heading1"/>
         <w:pageBreakBefore/>
       </w:pPr>
-      <w:bookmarkStart w:id="31" w:name="sec_022"/>
+      <w:bookmarkStart w:id="32" w:name="sec_023"/>
       <w:r>
         <w:t>8. Runoff and pond geometry</w:t>
       </w:r>
-      <w:bookmarkEnd w:id="31"/>
+      <w:bookmarkEnd w:id="32"/>
     </w:p>
     <w:p>
       <w:r>
@@ -4976,11 +5066,11 @@
         <w:pStyle w:val="Heading1"/>
         <w:pageBreakBefore/>
       </w:pPr>
-      <w:bookmarkStart w:id="32" w:name="sec_023"/>
+      <w:bookmarkStart w:id="33" w:name="sec_024"/>
       <w:r>
         <w:t>9. Frontend and visualization</w:t>
       </w:r>
-      <w:bookmarkEnd w:id="32"/>
+      <w:bookmarkEnd w:id="33"/>
     </w:p>
     <w:p>
       <w:pPr>
@@ -5121,11 +5211,11 @@
         <w:pStyle w:val="Heading1"/>
         <w:pageBreakBefore/>
       </w:pPr>
-      <w:bookmarkStart w:id="33" w:name="sec_024"/>
+      <w:bookmarkStart w:id="34" w:name="sec_025"/>
       <w:r>
         <w:t>10. API, errors, and security</w:t>
       </w:r>
-      <w:bookmarkEnd w:id="33"/>
+      <w:bookmarkEnd w:id="34"/>
     </w:p>
     <w:p>
       <w:r>
@@ -5168,11 +5258,11 @@
         <w:pStyle w:val="Heading1"/>
         <w:pageBreakBefore/>
       </w:pPr>
-      <w:bookmarkStart w:id="34" w:name="sec_025"/>
+      <w:bookmarkStart w:id="35" w:name="sec_026"/>
       <w:r>
         <w:t>11. Reliability and operations</w:t>
       </w:r>
-      <w:bookmarkEnd w:id="34"/>
+      <w:bookmarkEnd w:id="35"/>
     </w:p>
     <w:p>
       <w:r>
@@ -5203,11 +5293,11 @@
         <w:pStyle w:val="Heading1"/>
         <w:pageBreakBefore/>
       </w:pPr>
-      <w:bookmarkStart w:id="35" w:name="sec_026"/>
+      <w:bookmarkStart w:id="36" w:name="sec_027"/>
       <w:r>
         <w:t>12. Verification evidence</w:t>
       </w:r>
-      <w:bookmarkEnd w:id="35"/>
+      <w:bookmarkEnd w:id="36"/>
     </w:p>
     <w:p>
       <w:r>
@@ -5797,7 +5887,7 @@
                 <w:color w:val="0B2B24"/>
                 <w:sz w:val="17"/>
               </w:rPr>
-              <w:t>Hosted manual point selection</w:t>
+              <w:t>Teacher multipart contract</w:t>
             </w:r>
           </w:p>
         </w:tc>
@@ -5818,7 +5908,7 @@
                 <w:color w:val="0B2B24"/>
                 <w:sz w:val="17"/>
               </w:rPr>
-              <w:t>HTTP 200; catchment recomputed to 301.1143 ha</w:t>
+              <w:t>contour_map upload returned HTTP 200 and complete output</w:t>
             </w:r>
           </w:p>
         </w:tc>
@@ -5841,7 +5931,7 @@
                 <w:color w:val="0B2B24"/>
                 <w:sz w:val="17"/>
               </w:rPr>
-              <w:t>Hosted region selection</w:t>
+              <w:t>Independent formula reconciliation</w:t>
             </w:r>
           </w:p>
         </w:tc>
@@ -5862,7 +5952,7 @@
                 <w:color w:val="0B2B24"/>
                 <w:sz w:val="17"/>
               </w:rPr>
-              <w:t>HTTP 200; option 2 selected, 381.4633 ha</w:t>
+              <w:t>Area, runoff, and 80% capacity matched within rounding precision</w:t>
             </w:r>
           </w:p>
         </w:tc>
@@ -5885,7 +5975,7 @@
                 <w:color w:val="0B2B24"/>
                 <w:sz w:val="17"/>
               </w:rPr>
-              <w:t>Hosted KMZ upload</w:t>
+              <w:t>Candidate safety invariants</w:t>
             </w:r>
           </w:p>
         </w:tc>
@@ -5906,7 +5996,7 @@
                 <w:color w:val="0B2B24"/>
                 <w:sz w:val="17"/>
               </w:rPr>
-              <w:t>HTTP 200; result matched the source KML</w:t>
+              <w:t>All three options passed 60 m detected-water and 75 m boundary gates</w:t>
             </w:r>
           </w:p>
         </w:tc>
@@ -5929,7 +6019,7 @@
                 <w:color w:val="0B2B24"/>
                 <w:sz w:val="17"/>
               </w:rPr>
-              <w:t>Hosted invalid point</w:t>
+              <w:t>Hosted manual point selection</w:t>
             </w:r>
           </w:p>
         </w:tc>
@@ -5950,7 +6040,7 @@
                 <w:color w:val="0B2B24"/>
                 <w:sz w:val="17"/>
               </w:rPr>
-              <w:t>HTTP 422, typed invalid_contour_selection</w:t>
+              <w:t>HTTP 200; catchment recomputed to 301.1143 ha</w:t>
             </w:r>
           </w:p>
         </w:tc>
@@ -5973,7 +6063,7 @@
                 <w:color w:val="0B2B24"/>
                 <w:sz w:val="17"/>
               </w:rPr>
-              <w:t>OpenAPI schema route</w:t>
+              <w:t>Hosted region selection</w:t>
             </w:r>
           </w:p>
         </w:tc>
@@ -5994,7 +6084,7 @@
                 <w:color w:val="0B2B24"/>
                 <w:sz w:val="17"/>
               </w:rPr>
-              <w:t>Passed</w:t>
+              <w:t>HTTP 200; option 2 selected, 381.4633 ha</w:t>
             </w:r>
           </w:p>
         </w:tc>
@@ -6017,7 +6107,7 @@
                 <w:color w:val="0B2B24"/>
                 <w:sz w:val="17"/>
               </w:rPr>
-              <w:t>Docker backend build</w:t>
+              <w:t>Hosted KMZ upload</w:t>
             </w:r>
           </w:p>
         </w:tc>
@@ -6038,7 +6128,7 @@
                 <w:color w:val="0B2B24"/>
                 <w:sz w:val="17"/>
               </w:rPr>
-              <w:t>Included in local/CI verification</w:t>
+              <w:t>HTTP 200; result matched the source KML</w:t>
             </w:r>
           </w:p>
         </w:tc>
@@ -6061,7 +6151,7 @@
                 <w:color w:val="0B2B24"/>
                 <w:sz w:val="17"/>
               </w:rPr>
-              <w:t>Docker frontend build</w:t>
+              <w:t>Hosted invalid point</w:t>
             </w:r>
           </w:p>
         </w:tc>
@@ -6082,7 +6172,7 @@
                 <w:color w:val="0B2B24"/>
                 <w:sz w:val="17"/>
               </w:rPr>
-              <w:t>Included in local/CI verification</w:t>
+              <w:t>HTTP 422, typed invalid_contour_selection</w:t>
             </w:r>
           </w:p>
         </w:tc>
@@ -6105,7 +6195,7 @@
                 <w:color w:val="0B2B24"/>
                 <w:sz w:val="17"/>
               </w:rPr>
-              <w:t>Alembic PostgreSQL migration</w:t>
+              <w:t>OpenAPI schema route</w:t>
             </w:r>
           </w:p>
         </w:tc>
@@ -6126,7 +6216,7 @@
                 <w:color w:val="0B2B24"/>
                 <w:sz w:val="17"/>
               </w:rPr>
-              <w:t>Included in GitHub Actions</w:t>
+              <w:t>Passed</w:t>
             </w:r>
           </w:p>
         </w:tc>
@@ -6149,7 +6239,7 @@
                 <w:color w:val="0B2B24"/>
                 <w:sz w:val="17"/>
               </w:rPr>
-              <w:t>Hosted frontend and security headers</w:t>
+              <w:t>Docker backend build</w:t>
             </w:r>
           </w:p>
         </w:tc>
@@ -6170,7 +6260,7 @@
                 <w:color w:val="0B2B24"/>
                 <w:sz w:val="17"/>
               </w:rPr>
-              <w:t>HTTP 200; frame, MIME and referrer headers passed</w:t>
+              <w:t>Included in local/CI verification</w:t>
             </w:r>
           </w:p>
         </w:tc>
@@ -6193,7 +6283,7 @@
                 <w:color w:val="0B2B24"/>
                 <w:sz w:val="17"/>
               </w:rPr>
-              <w:t>Hosted API readiness and OpenAPI</w:t>
+              <w:t>Docker frontend build</w:t>
             </w:r>
           </w:p>
         </w:tc>
@@ -6214,7 +6304,7 @@
                 <w:color w:val="0B2B24"/>
                 <w:sz w:val="17"/>
               </w:rPr>
-              <w:t>Verified through the deployed service</w:t>
+              <w:t>Included in local/CI verification</w:t>
             </w:r>
           </w:p>
         </w:tc>
@@ -6237,7 +6327,7 @@
                 <w:color w:val="0B2B24"/>
                 <w:sz w:val="17"/>
               </w:rPr>
-              <w:t>Hosted 2 km location analysis</w:t>
+              <w:t>Alembic PostgreSQL migration</w:t>
             </w:r>
           </w:p>
         </w:tc>
@@ -6258,7 +6348,227 @@
                 <w:color w:val="0B2B24"/>
                 <w:sz w:val="17"/>
               </w:rPr>
+              <w:t>Included in GitHub Actions</w:t>
+            </w:r>
+          </w:p>
+        </w:tc>
+      </w:tr>
+      <w:tr>
+        <w:tc>
+          <w:tcPr>
+            <w:tcW w:type="dxa" w:w="3300"/>
+          </w:tcPr>
+          <w:p>
+            <w:pPr>
+              <w:spacing w:after="0" w:line="264" w:lineRule="auto"/>
+            </w:pPr>
+            <w:r/>
+            <w:r>
+              <w:rPr>
+                <w:rFonts w:ascii="Calibri" w:hAnsi="Calibri"/>
+                <w:b w:val="0"/>
+                <w:i w:val="0"/>
+                <w:color w:val="0B2B24"/>
+                <w:sz w:val="17"/>
+              </w:rPr>
+              <w:t>Hosted frontend and security headers</w:t>
+            </w:r>
+          </w:p>
+        </w:tc>
+        <w:tc>
+          <w:tcPr>
+            <w:tcW w:type="dxa" w:w="6060"/>
+          </w:tcPr>
+          <w:p>
+            <w:pPr>
+              <w:spacing w:after="0" w:line="264" w:lineRule="auto"/>
+            </w:pPr>
+            <w:r/>
+            <w:r>
+              <w:rPr>
+                <w:rFonts w:ascii="Calibri" w:hAnsi="Calibri"/>
+                <w:b w:val="0"/>
+                <w:i w:val="0"/>
+                <w:color w:val="0B2B24"/>
+                <w:sz w:val="17"/>
+              </w:rPr>
+              <w:t>HTTP 200; frame, MIME and referrer headers passed</w:t>
+            </w:r>
+          </w:p>
+        </w:tc>
+      </w:tr>
+      <w:tr>
+        <w:tc>
+          <w:tcPr>
+            <w:tcW w:type="dxa" w:w="3300"/>
+          </w:tcPr>
+          <w:p>
+            <w:pPr>
+              <w:spacing w:after="0" w:line="264" w:lineRule="auto"/>
+            </w:pPr>
+            <w:r/>
+            <w:r>
+              <w:rPr>
+                <w:rFonts w:ascii="Calibri" w:hAnsi="Calibri"/>
+                <w:b w:val="0"/>
+                <w:i w:val="0"/>
+                <w:color w:val="0B2B24"/>
+                <w:sz w:val="17"/>
+              </w:rPr>
+              <w:t>Hosted API readiness and OpenAPI</w:t>
+            </w:r>
+          </w:p>
+        </w:tc>
+        <w:tc>
+          <w:tcPr>
+            <w:tcW w:type="dxa" w:w="6060"/>
+          </w:tcPr>
+          <w:p>
+            <w:pPr>
+              <w:spacing w:after="0" w:line="264" w:lineRule="auto"/>
+            </w:pPr>
+            <w:r/>
+            <w:r>
+              <w:rPr>
+                <w:rFonts w:ascii="Calibri" w:hAnsi="Calibri"/>
+                <w:b w:val="0"/>
+                <w:i w:val="0"/>
+                <w:color w:val="0B2B24"/>
+                <w:sz w:val="17"/>
+              </w:rPr>
+              <w:t>Verified through the deployed service</w:t>
+            </w:r>
+          </w:p>
+        </w:tc>
+      </w:tr>
+      <w:tr>
+        <w:tc>
+          <w:tcPr>
+            <w:tcW w:type="dxa" w:w="3300"/>
+          </w:tcPr>
+          <w:p>
+            <w:pPr>
+              <w:spacing w:after="0" w:line="264" w:lineRule="auto"/>
+            </w:pPr>
+            <w:r/>
+            <w:r>
+              <w:rPr>
+                <w:rFonts w:ascii="Calibri" w:hAnsi="Calibri"/>
+                <w:b w:val="0"/>
+                <w:i w:val="0"/>
+                <w:color w:val="0B2B24"/>
+                <w:sz w:val="17"/>
+              </w:rPr>
+              <w:t>Hosted 2 km location analysis</w:t>
+            </w:r>
+          </w:p>
+        </w:tc>
+        <w:tc>
+          <w:tcPr>
+            <w:tcW w:type="dxa" w:w="6060"/>
+          </w:tcPr>
+          <w:p>
+            <w:pPr>
+              <w:spacing w:after="0" w:line="264" w:lineRule="auto"/>
+            </w:pPr>
+            <w:r/>
+            <w:r>
+              <w:rPr>
+                <w:rFonts w:ascii="Calibri" w:hAnsi="Calibri"/>
+                <w:b w:val="0"/>
+                <w:i w:val="0"/>
+                <w:color w:val="0B2B24"/>
+                <w:sz w:val="17"/>
+              </w:rPr>
               <w:t>35 rainfall years; 152.07 ha selected catchment; three pond options</w:t>
+            </w:r>
+          </w:p>
+        </w:tc>
+      </w:tr>
+      <w:tr>
+        <w:tc>
+          <w:tcPr>
+            <w:tcW w:type="dxa" w:w="3300"/>
+          </w:tcPr>
+          <w:p>
+            <w:pPr>
+              <w:spacing w:after="0" w:line="264" w:lineRule="auto"/>
+            </w:pPr>
+            <w:r/>
+            <w:r>
+              <w:rPr>
+                <w:rFonts w:ascii="Calibri" w:hAnsi="Calibri"/>
+                <w:b w:val="0"/>
+                <w:i w:val="0"/>
+                <w:color w:val="0B2B24"/>
+                <w:sz w:val="17"/>
+              </w:rPr>
+              <w:t>Course machine ports 2238, 2239, 2240</w:t>
+            </w:r>
+          </w:p>
+        </w:tc>
+        <w:tc>
+          <w:tcPr>
+            <w:tcW w:type="dxa" w:w="6060"/>
+          </w:tcPr>
+          <w:p>
+            <w:pPr>
+              <w:spacing w:after="0" w:line="264" w:lineRule="auto"/>
+            </w:pPr>
+            <w:r/>
+            <w:r>
+              <w:rPr>
+                <w:rFonts w:ascii="Calibri" w:hAnsi="Calibri"/>
+                <w:b w:val="0"/>
+                <w:i w:val="0"/>
+                <w:color w:val="0B2B24"/>
+                <w:sz w:val="17"/>
+              </w:rPr>
+              <w:t>Remote HTTPS liveness returned HTTP 200</w:t>
+            </w:r>
+          </w:p>
+        </w:tc>
+      </w:tr>
+      <w:tr>
+        <w:tc>
+          <w:tcPr>
+            <w:tcW w:type="dxa" w:w="3300"/>
+          </w:tcPr>
+          <w:p>
+            <w:pPr>
+              <w:spacing w:after="0" w:line="264" w:lineRule="auto"/>
+            </w:pPr>
+            <w:r/>
+            <w:r>
+              <w:rPr>
+                <w:rFonts w:ascii="Calibri" w:hAnsi="Calibri"/>
+                <w:b w:val="0"/>
+                <w:i w:val="0"/>
+                <w:color w:val="0B2B24"/>
+                <w:sz w:val="17"/>
+              </w:rPr>
+              <w:t>Course machine port 2235</w:t>
+            </w:r>
+          </w:p>
+        </w:tc>
+        <w:tc>
+          <w:tcPr>
+            <w:tcW w:type="dxa" w:w="6060"/>
+          </w:tcPr>
+          <w:p>
+            <w:pPr>
+              <w:spacing w:after="0" w:line="264" w:lineRule="auto"/>
+            </w:pPr>
+            <w:r/>
+            <w:r>
+              <w:rPr>
+                <w:rFonts w:ascii="Calibri" w:hAnsi="Calibri"/>
+                <w:b w:val="0"/>
+                <w:i w:val="0"/>
+                <w:color w:val="0B2B24"/>
+                <w:sz w:val="17"/>
+              </w:rPr>
+              <w:t>Login rejected before testing; machine credential/access issue, not an API response</w:t>
             </w:r>
           </w:p>
         </w:tc>
@@ -6286,11 +6596,11 @@
         <w:pStyle w:val="Heading1"/>
         <w:pageBreakBefore/>
       </w:pPr>
-      <w:bookmarkStart w:id="36" w:name="sec_027"/>
+      <w:bookmarkStart w:id="37" w:name="sec_028"/>
       <w:r>
         <w:t>13. Deployment and submission</w:t>
       </w:r>
-      <w:bookmarkEnd w:id="36"/>
+      <w:bookmarkEnd w:id="37"/>
     </w:p>
     <w:p>
       <w:r>
@@ -6301,7 +6611,7 @@
           <w:color w:val="0B2B24"/>
           <w:sz w:val="22"/>
         </w:rPr>
-        <w:t>The repository contains render.yaml for repeatable deployment in the Singapore region. Release 0a385c0 was deployed and verified on 29 August 2026:</w:t>
+        <w:t>The repository contains render.yaml for repeatable deployment in the Singapore region. Release a1ede18 was deployed and verified on 1 September 2026:</w:t>
       </w:r>
     </w:p>
     <w:p>
@@ -6394,7 +6704,19 @@
           <w:color w:val="0B2B24"/>
           <w:sz w:val="22"/>
         </w:rPr>
-        <w:t>Free Render web services can sleep after inactivity, so the first API request may require a cold-start wait. The final hosted KML verification processed all 1,355 contours and 159,113 source vertices in 12.47 seconds, returned three ranked and water-screened alternatives, and completed the rainfall, runoff, and pond-geometry branches. Point and region re-selection, KMZ upload, and negative selection rejection were then exercised against the same deployed release.</w:t>
+        <w:t>Free Render web services can sleep after inactivity, so the first API request may require a cold-start wait. The final hosted KML verification used the exact contour_map field, processed all 1,355 contours and 159,113 source vertices, returned HTTP 200 with a complete status and three ranked and water-screened alternatives, and completed the rainfall, runoff, and pond-geometry branches. Point and region re-selection, KMZ upload, and negative selection rejection were then exercised against the same deployed release.</w:t>
+      </w:r>
+    </w:p>
+    <w:p>
+      <w:r>
+        <w:rPr>
+          <w:rFonts w:ascii="Calibri" w:hAnsi="Calibri"/>
+          <w:b w:val="0"/>
+          <w:i w:val="0"/>
+          <w:color w:val="0B2B24"/>
+          <w:sz w:val="22"/>
+        </w:rPr>
+        <w:t>Remote HTTPS liveness was also tested from the supplied course development machines. Ports 2238, 2239, and 2240 each returned HTTP 200. Port 2235 rejected the supplied SSH login before the remote request could run; therefore its result is recorded as unverified rather than falsely reported as an API failure or pass. No machine password is stored in this repository or report.</w:t>
       </w:r>
     </w:p>
     <w:p>
@@ -6414,11 +6736,11 @@
         <w:pStyle w:val="Heading1"/>
         <w:pageBreakBefore/>
       </w:pPr>
-      <w:bookmarkStart w:id="37" w:name="sec_028"/>
+      <w:bookmarkStart w:id="38" w:name="sec_029"/>
       <w:r>
         <w:t>14. Limitations and required field work</w:t>
       </w:r>
-      <w:bookmarkEnd w:id="37"/>
+      <w:bookmarkEnd w:id="38"/>
     </w:p>
     <w:p>
       <w:r>
@@ -6601,11 +6923,11 @@
         <w:pStyle w:val="Heading1"/>
         <w:pageBreakBefore/>
       </w:pPr>
-      <w:bookmarkStart w:id="38" w:name="sec_029"/>
+      <w:bookmarkStart w:id="39" w:name="sec_030"/>
       <w:r>
         <w:t>15. AI-tool usage and academic integrity</w:t>
       </w:r>
-      <w:bookmarkEnd w:id="38"/>
+      <w:bookmarkEnd w:id="39"/>
     </w:p>
     <w:p>
       <w:r>
@@ -6624,11 +6946,11 @@
         <w:pStyle w:val="Heading1"/>
         <w:pageBreakBefore/>
       </w:pPr>
-      <w:bookmarkStart w:id="39" w:name="sec_030"/>
+      <w:bookmarkStart w:id="40" w:name="sec_031"/>
       <w:r>
         <w:t>16. Conclusion</w:t>
       </w:r>
-      <w:bookmarkEnd w:id="39"/>
+      <w:bookmarkEnd w:id="40"/>
     </w:p>
     <w:p>
       <w:r>
@@ -6647,11 +6969,11 @@
         <w:pStyle w:val="Heading1"/>
         <w:pageBreakBefore/>
       </w:pPr>
-      <w:bookmarkStart w:id="40" w:name="sec_031"/>
+      <w:bookmarkStart w:id="41" w:name="sec_032"/>
       <w:r>
         <w:t>References</w:t>
       </w:r>
-      <w:bookmarkEnd w:id="40"/>
+      <w:bookmarkEnd w:id="41"/>
     </w:p>
     <w:p>
       <w:pPr>
@@ -8719,7 +9041,7 @@
                 <w:color w:val="0B2B24"/>
                 <w:sz w:val="17"/>
               </w:rPr>
-              <w:t>reliable / degraded / incomplete</w:t>
+              <w:t>complete / degraded / incomplete</w:t>
             </w:r>
           </w:p>
         </w:tc>
@@ -8740,7 +9062,7 @@
                 <w:color w:val="0B2B24"/>
                 <w:sz w:val="17"/>
               </w:rPr>
-              <w:t>Overall evidence status; contour interpolation remains degraded by design</w:t>
+              <w:t>Whether computation finished; nested quality metadata separately reports evidence limitations</w:t>
             </w:r>
           </w:p>
         </w:tc>
@@ -10165,7 +10487,7 @@
               </w:rPr>
               <w:t>curl.exe -X POST ^</w:t>
               <w:br/>
-              <w:t xml:space="preserve">  -F "contour_file=@C:\path\contours_1m.kml" ^</w:t>
+              <w:t xml:space="preserve">  -F "contour_map=@C:\path\contours_1m.kml" ^</w:t>
               <w:br/>
               <w:t xml:space="preserve">  -F "selection_mode=automatic" ^</w:t>
               <w:br/>
@@ -10231,7 +10553,7 @@
               </w:rPr>
               <w:t>curl.exe -X POST ^</w:t>
               <w:br/>
-              <w:t xml:space="preserve">  -F "contour_file=@C:\path\contours_1m.kml" ^</w:t>
+              <w:t xml:space="preserve">  -F "contour_map=@C:\path\contours_1m.kml" ^</w:t>
               <w:br/>
               <w:t xml:space="preserve">  -F "selection_mode=point" ^</w:t>
               <w:br/>

</xml_diff>